<commit_message>
Class 10 exercises in progress
</commit_message>
<xml_diff>
--- a/Class 10 Pointers & Lists/Practice - Pointers and Dynamic Memory.docx
+++ b/Class 10 Pointers & Lists/Practice - Pointers and Dynamic Memory.docx
@@ -141,41 +141,13 @@
           <w:szCs w:val="22"/>
         </w:rPr>
       </w:pPr>
-      <w:proofErr w:type="spellStart"/>
-      <w:r>
-        <w:rPr>
-          <w:rFonts w:ascii="Consolas" w:eastAsia="Consolas" w:hAnsi="Consolas" w:cs="Consolas"/>
-          <w:sz w:val="22"/>
-          <w:szCs w:val="22"/>
-        </w:rPr>
-        <w:t>cout</w:t>
-      </w:r>
-      <w:proofErr w:type="spellEnd"/>
-      <w:r>
-        <w:rPr>
-          <w:rFonts w:ascii="Consolas" w:eastAsia="Consolas" w:hAnsi="Consolas" w:cs="Consolas"/>
-          <w:sz w:val="22"/>
-          <w:szCs w:val="22"/>
-        </w:rPr>
-        <w:t xml:space="preserve"> &lt;&lt; a &lt;&lt; " " &lt;&lt; *p &lt;&lt; </w:t>
-      </w:r>
-      <w:proofErr w:type="spellStart"/>
-      <w:r>
-        <w:rPr>
-          <w:rFonts w:ascii="Consolas" w:eastAsia="Consolas" w:hAnsi="Consolas" w:cs="Consolas"/>
-          <w:sz w:val="22"/>
-          <w:szCs w:val="22"/>
-        </w:rPr>
-        <w:t>endl</w:t>
-      </w:r>
-      <w:proofErr w:type="spellEnd"/>
-      <w:r>
-        <w:rPr>
-          <w:rFonts w:ascii="Consolas" w:eastAsia="Consolas" w:hAnsi="Consolas" w:cs="Consolas"/>
-          <w:sz w:val="22"/>
-          <w:szCs w:val="22"/>
-        </w:rPr>
-        <w:t>;</w:t>
+      <w:r>
+        <w:rPr>
+          <w:rFonts w:ascii="Consolas" w:eastAsia="Consolas" w:hAnsi="Consolas" w:cs="Consolas"/>
+          <w:sz w:val="22"/>
+          <w:szCs w:val="22"/>
+        </w:rPr>
+        <w:t>cout &lt;&lt; a &lt;&lt; " " &lt;&lt; *p &lt;&lt; endl;</w:t>
       </w:r>
     </w:p>
     <w:p>
@@ -317,41 +289,13 @@
           <w:szCs w:val="22"/>
         </w:rPr>
       </w:pPr>
-      <w:proofErr w:type="spellStart"/>
-      <w:r>
-        <w:rPr>
-          <w:rFonts w:ascii="Consolas" w:eastAsia="Consolas" w:hAnsi="Consolas" w:cs="Consolas"/>
-          <w:sz w:val="22"/>
-          <w:szCs w:val="22"/>
-        </w:rPr>
-        <w:t>cout</w:t>
-      </w:r>
-      <w:proofErr w:type="spellEnd"/>
-      <w:r>
-        <w:rPr>
-          <w:rFonts w:ascii="Consolas" w:eastAsia="Consolas" w:hAnsi="Consolas" w:cs="Consolas"/>
-          <w:sz w:val="22"/>
-          <w:szCs w:val="22"/>
-        </w:rPr>
-        <w:t xml:space="preserve"> &lt;&lt; *p &lt;&lt; " " &lt;&lt; *q &lt;&lt; </w:t>
-      </w:r>
-      <w:proofErr w:type="spellStart"/>
-      <w:r>
-        <w:rPr>
-          <w:rFonts w:ascii="Consolas" w:eastAsia="Consolas" w:hAnsi="Consolas" w:cs="Consolas"/>
-          <w:sz w:val="22"/>
-          <w:szCs w:val="22"/>
-        </w:rPr>
-        <w:t>endl</w:t>
-      </w:r>
-      <w:proofErr w:type="spellEnd"/>
-      <w:r>
-        <w:rPr>
-          <w:rFonts w:ascii="Consolas" w:eastAsia="Consolas" w:hAnsi="Consolas" w:cs="Consolas"/>
-          <w:sz w:val="22"/>
-          <w:szCs w:val="22"/>
-        </w:rPr>
-        <w:t>;</w:t>
+      <w:r>
+        <w:rPr>
+          <w:rFonts w:ascii="Consolas" w:eastAsia="Consolas" w:hAnsi="Consolas" w:cs="Consolas"/>
+          <w:sz w:val="22"/>
+          <w:szCs w:val="22"/>
+        </w:rPr>
+        <w:t>cout &lt;&lt; *p &lt;&lt; " " &lt;&lt; *q &lt;&lt; endl;</w:t>
       </w:r>
     </w:p>
     <w:p>
@@ -499,41 +443,13 @@
         <w:spacing w:line="245" w:lineRule="exact"/>
         <w:ind w:left="230" w:right="170"/>
       </w:pPr>
-      <w:proofErr w:type="spellStart"/>
-      <w:r>
-        <w:rPr>
-          <w:rFonts w:ascii="Consolas" w:eastAsia="Consolas" w:hAnsi="Consolas" w:cs="Consolas"/>
-          <w:sz w:val="22"/>
-          <w:szCs w:val="22"/>
-        </w:rPr>
-        <w:t>cout</w:t>
-      </w:r>
-      <w:proofErr w:type="spellEnd"/>
-      <w:r>
-        <w:rPr>
-          <w:rFonts w:ascii="Consolas" w:eastAsia="Consolas" w:hAnsi="Consolas" w:cs="Consolas"/>
-          <w:sz w:val="22"/>
-          <w:szCs w:val="22"/>
-        </w:rPr>
-        <w:t xml:space="preserve"> &lt;&lt; a &lt;&lt; " " &lt;&lt; b &lt;&lt; </w:t>
-      </w:r>
-      <w:proofErr w:type="spellStart"/>
-      <w:r>
-        <w:rPr>
-          <w:rFonts w:ascii="Consolas" w:eastAsia="Consolas" w:hAnsi="Consolas" w:cs="Consolas"/>
-          <w:sz w:val="22"/>
-          <w:szCs w:val="22"/>
-        </w:rPr>
-        <w:t>endl</w:t>
-      </w:r>
-      <w:proofErr w:type="spellEnd"/>
-      <w:r>
-        <w:rPr>
-          <w:rFonts w:ascii="Consolas" w:eastAsia="Consolas" w:hAnsi="Consolas" w:cs="Consolas"/>
-          <w:sz w:val="22"/>
-          <w:szCs w:val="22"/>
-        </w:rPr>
-        <w:t>;</w:t>
+      <w:r>
+        <w:rPr>
+          <w:rFonts w:ascii="Consolas" w:eastAsia="Consolas" w:hAnsi="Consolas" w:cs="Consolas"/>
+          <w:sz w:val="22"/>
+          <w:szCs w:val="22"/>
+        </w:rPr>
+        <w:t>cout &lt;&lt; a &lt;&lt; " " &lt;&lt; b &lt;&lt; endl;</w:t>
       </w:r>
     </w:p>
     <w:p>
@@ -595,41 +511,13 @@
           <w:szCs w:val="22"/>
         </w:rPr>
       </w:pPr>
-      <w:proofErr w:type="spellStart"/>
-      <w:r>
-        <w:rPr>
-          <w:rFonts w:ascii="Consolas" w:eastAsia="Consolas" w:hAnsi="Consolas" w:cs="Consolas"/>
-          <w:sz w:val="22"/>
-          <w:szCs w:val="22"/>
-        </w:rPr>
-        <w:t>cout</w:t>
-      </w:r>
-      <w:proofErr w:type="spellEnd"/>
-      <w:r>
-        <w:rPr>
-          <w:rFonts w:ascii="Consolas" w:eastAsia="Consolas" w:hAnsi="Consolas" w:cs="Consolas"/>
-          <w:sz w:val="22"/>
-          <w:szCs w:val="22"/>
-        </w:rPr>
-        <w:t xml:space="preserve"> &lt;&lt; a &lt;&lt; " " &lt;&lt; b &lt;&lt; </w:t>
-      </w:r>
-      <w:proofErr w:type="spellStart"/>
-      <w:r>
-        <w:rPr>
-          <w:rFonts w:ascii="Consolas" w:eastAsia="Consolas" w:hAnsi="Consolas" w:cs="Consolas"/>
-          <w:sz w:val="22"/>
-          <w:szCs w:val="22"/>
-        </w:rPr>
-        <w:t>endl</w:t>
-      </w:r>
-      <w:proofErr w:type="spellEnd"/>
-      <w:r>
-        <w:rPr>
-          <w:rFonts w:ascii="Consolas" w:eastAsia="Consolas" w:hAnsi="Consolas" w:cs="Consolas"/>
-          <w:sz w:val="22"/>
-          <w:szCs w:val="22"/>
-        </w:rPr>
-        <w:t>;</w:t>
+      <w:r>
+        <w:rPr>
+          <w:rFonts w:ascii="Consolas" w:eastAsia="Consolas" w:hAnsi="Consolas" w:cs="Consolas"/>
+          <w:sz w:val="22"/>
+          <w:szCs w:val="22"/>
+        </w:rPr>
+        <w:t>cout &lt;&lt; a &lt;&lt; " " &lt;&lt; b &lt;&lt; endl;</w:t>
       </w:r>
     </w:p>
     <w:p>
@@ -760,58 +648,22 @@
           <w:sz w:val="22"/>
           <w:szCs w:val="22"/>
         </w:rPr>
-        <w:t xml:space="preserve">void </w:t>
-      </w:r>
-      <w:proofErr w:type="spellStart"/>
-      <w:r>
-        <w:rPr>
-          <w:rFonts w:ascii="Consolas" w:eastAsia="Consolas" w:hAnsi="Consolas" w:cs="Consolas"/>
-          <w:sz w:val="22"/>
-          <w:szCs w:val="22"/>
-        </w:rPr>
-        <w:t>addTen</w:t>
-      </w:r>
-      <w:proofErr w:type="spellEnd"/>
-      <w:r>
-        <w:rPr>
-          <w:rFonts w:ascii="Consolas" w:eastAsia="Consolas" w:hAnsi="Consolas" w:cs="Consolas"/>
-          <w:sz w:val="22"/>
-          <w:szCs w:val="22"/>
-        </w:rPr>
-        <w:t>(int  x)    { x  += 10; }</w:t>
-      </w:r>
-    </w:p>
-    <w:p>
-      <w:pPr>
-        <w:shd w:val="clear" w:color="auto" w:fill="F1F4F7"/>
-        <w:spacing w:line="245" w:lineRule="exact"/>
-        <w:ind w:left="230" w:right="170"/>
-      </w:pPr>
-      <w:r>
-        <w:rPr>
-          <w:rFonts w:ascii="Consolas" w:eastAsia="Consolas" w:hAnsi="Consolas" w:cs="Consolas"/>
-          <w:sz w:val="22"/>
-          <w:szCs w:val="22"/>
-        </w:rPr>
-        <w:t xml:space="preserve">void </w:t>
-      </w:r>
-      <w:proofErr w:type="spellStart"/>
-      <w:r>
-        <w:rPr>
-          <w:rFonts w:ascii="Consolas" w:eastAsia="Consolas" w:hAnsi="Consolas" w:cs="Consolas"/>
-          <w:sz w:val="22"/>
-          <w:szCs w:val="22"/>
-        </w:rPr>
-        <w:t>addTwenty</w:t>
-      </w:r>
-      <w:proofErr w:type="spellEnd"/>
-      <w:r>
-        <w:rPr>
-          <w:rFonts w:ascii="Consolas" w:eastAsia="Consolas" w:hAnsi="Consolas" w:cs="Consolas"/>
-          <w:sz w:val="22"/>
-          <w:szCs w:val="22"/>
-        </w:rPr>
-        <w:t>(int *x) { *x += 20; }</w:t>
+        <w:t>void addTen(int  x)    { x  += 10; }</w:t>
+      </w:r>
+    </w:p>
+    <w:p>
+      <w:pPr>
+        <w:shd w:val="clear" w:color="auto" w:fill="F1F4F7"/>
+        <w:spacing w:line="245" w:lineRule="exact"/>
+        <w:ind w:left="230" w:right="170"/>
+      </w:pPr>
+      <w:r>
+        <w:rPr>
+          <w:rFonts w:ascii="Consolas" w:eastAsia="Consolas" w:hAnsi="Consolas" w:cs="Consolas"/>
+          <w:sz w:val="22"/>
+          <w:szCs w:val="22"/>
+        </w:rPr>
+        <w:t>void addTwenty(int *x) { *x += 20; }</w:t>
       </w:r>
     </w:p>
     <w:p>
@@ -850,48 +702,28 @@
         <w:spacing w:line="245" w:lineRule="exact"/>
         <w:ind w:left="230" w:right="170"/>
       </w:pPr>
-      <w:proofErr w:type="spellStart"/>
-      <w:r>
-        <w:rPr>
-          <w:rFonts w:ascii="Consolas" w:eastAsia="Consolas" w:hAnsi="Consolas" w:cs="Consolas"/>
-          <w:sz w:val="22"/>
-          <w:szCs w:val="22"/>
-        </w:rPr>
-        <w:t>addTen</w:t>
-      </w:r>
-      <w:proofErr w:type="spellEnd"/>
-      <w:r>
-        <w:rPr>
-          <w:rFonts w:ascii="Consolas" w:eastAsia="Consolas" w:hAnsi="Consolas" w:cs="Consolas"/>
-          <w:sz w:val="22"/>
-          <w:szCs w:val="22"/>
-        </w:rPr>
-        <w:t>(n);</w:t>
-      </w:r>
-    </w:p>
-    <w:p>
-      <w:pPr>
-        <w:shd w:val="clear" w:color="auto" w:fill="F1F4F7"/>
-        <w:spacing w:line="245" w:lineRule="exact"/>
-        <w:ind w:left="230" w:right="170"/>
-      </w:pPr>
-      <w:proofErr w:type="spellStart"/>
-      <w:r>
-        <w:rPr>
-          <w:rFonts w:ascii="Consolas" w:eastAsia="Consolas" w:hAnsi="Consolas" w:cs="Consolas"/>
-          <w:sz w:val="22"/>
-          <w:szCs w:val="22"/>
-        </w:rPr>
-        <w:t>addTwenty</w:t>
-      </w:r>
-      <w:proofErr w:type="spellEnd"/>
-      <w:r>
-        <w:rPr>
-          <w:rFonts w:ascii="Consolas" w:eastAsia="Consolas" w:hAnsi="Consolas" w:cs="Consolas"/>
-          <w:sz w:val="22"/>
-          <w:szCs w:val="22"/>
-        </w:rPr>
-        <w:t>(&amp;n);</w:t>
+      <w:r>
+        <w:rPr>
+          <w:rFonts w:ascii="Consolas" w:eastAsia="Consolas" w:hAnsi="Consolas" w:cs="Consolas"/>
+          <w:sz w:val="22"/>
+          <w:szCs w:val="22"/>
+        </w:rPr>
+        <w:t>addTen(n);</w:t>
+      </w:r>
+    </w:p>
+    <w:p>
+      <w:pPr>
+        <w:shd w:val="clear" w:color="auto" w:fill="F1F4F7"/>
+        <w:spacing w:line="245" w:lineRule="exact"/>
+        <w:ind w:left="230" w:right="170"/>
+      </w:pPr>
+      <w:r>
+        <w:rPr>
+          <w:rFonts w:ascii="Consolas" w:eastAsia="Consolas" w:hAnsi="Consolas" w:cs="Consolas"/>
+          <w:sz w:val="22"/>
+          <w:szCs w:val="22"/>
+        </w:rPr>
+        <w:t>addTwenty(&amp;n);</w:t>
       </w:r>
     </w:p>
     <w:p>
@@ -905,41 +737,13 @@
           <w:szCs w:val="22"/>
         </w:rPr>
       </w:pPr>
-      <w:proofErr w:type="spellStart"/>
-      <w:r>
-        <w:rPr>
-          <w:rFonts w:ascii="Consolas" w:eastAsia="Consolas" w:hAnsi="Consolas" w:cs="Consolas"/>
-          <w:sz w:val="22"/>
-          <w:szCs w:val="22"/>
-        </w:rPr>
-        <w:t>cout</w:t>
-      </w:r>
-      <w:proofErr w:type="spellEnd"/>
-      <w:r>
-        <w:rPr>
-          <w:rFonts w:ascii="Consolas" w:eastAsia="Consolas" w:hAnsi="Consolas" w:cs="Consolas"/>
-          <w:sz w:val="22"/>
-          <w:szCs w:val="22"/>
-        </w:rPr>
-        <w:t xml:space="preserve"> &lt;&lt; n &lt;&lt; </w:t>
-      </w:r>
-      <w:proofErr w:type="spellStart"/>
-      <w:r>
-        <w:rPr>
-          <w:rFonts w:ascii="Consolas" w:eastAsia="Consolas" w:hAnsi="Consolas" w:cs="Consolas"/>
-          <w:sz w:val="22"/>
-          <w:szCs w:val="22"/>
-        </w:rPr>
-        <w:t>endl</w:t>
-      </w:r>
-      <w:proofErr w:type="spellEnd"/>
-      <w:r>
-        <w:rPr>
-          <w:rFonts w:ascii="Consolas" w:eastAsia="Consolas" w:hAnsi="Consolas" w:cs="Consolas"/>
-          <w:sz w:val="22"/>
-          <w:szCs w:val="22"/>
-        </w:rPr>
-        <w:t>;</w:t>
+      <w:r>
+        <w:rPr>
+          <w:rFonts w:ascii="Consolas" w:eastAsia="Consolas" w:hAnsi="Consolas" w:cs="Consolas"/>
+          <w:sz w:val="22"/>
+          <w:szCs w:val="22"/>
+        </w:rPr>
+        <w:t>cout &lt;&lt; n &lt;&lt; endl;</w:t>
       </w:r>
     </w:p>
     <w:p>
@@ -1055,37 +859,35 @@
         <w:shd w:val="clear" w:color="auto" w:fill="F1F4F7"/>
         <w:spacing w:line="245" w:lineRule="exact"/>
         <w:ind w:left="230" w:right="170"/>
-      </w:pPr>
-      <w:proofErr w:type="spellStart"/>
-      <w:r>
-        <w:rPr>
-          <w:rFonts w:ascii="Consolas" w:eastAsia="Consolas" w:hAnsi="Consolas" w:cs="Consolas"/>
-          <w:sz w:val="22"/>
-          <w:szCs w:val="22"/>
-        </w:rPr>
-        <w:t>cout</w:t>
-      </w:r>
-      <w:proofErr w:type="spellEnd"/>
-      <w:r>
-        <w:rPr>
-          <w:rFonts w:ascii="Consolas" w:eastAsia="Consolas" w:hAnsi="Consolas" w:cs="Consolas"/>
-          <w:sz w:val="22"/>
-          <w:szCs w:val="22"/>
-        </w:rPr>
-        <w:t xml:space="preserve"> &lt;&lt; (*p == *q) &lt;&lt; " "</w:t>
-      </w:r>
-    </w:p>
-    <w:p>
-      <w:pPr>
-        <w:shd w:val="clear" w:color="auto" w:fill="F1F4F7"/>
-        <w:spacing w:line="245" w:lineRule="exact"/>
-        <w:ind w:left="230" w:right="170"/>
-      </w:pPr>
-      <w:r>
-        <w:rPr>
-          <w:rFonts w:ascii="Consolas" w:eastAsia="Consolas" w:hAnsi="Consolas" w:cs="Consolas"/>
-          <w:sz w:val="22"/>
-          <w:szCs w:val="22"/>
+        <w:rPr>
+          <w:lang w:val="fr-FR"/>
+        </w:rPr>
+      </w:pPr>
+      <w:r>
+        <w:rPr>
+          <w:rFonts w:ascii="Consolas" w:eastAsia="Consolas" w:hAnsi="Consolas" w:cs="Consolas"/>
+          <w:sz w:val="22"/>
+          <w:szCs w:val="22"/>
+          <w:lang w:val="fr-FR"/>
+        </w:rPr>
+        <w:t>cout &lt;&lt; (*p == *q) &lt;&lt; " "</w:t>
+      </w:r>
+    </w:p>
+    <w:p>
+      <w:pPr>
+        <w:shd w:val="clear" w:color="auto" w:fill="F1F4F7"/>
+        <w:spacing w:line="245" w:lineRule="exact"/>
+        <w:ind w:left="230" w:right="170"/>
+        <w:rPr>
+          <w:lang w:val="fr-FR"/>
+        </w:rPr>
+      </w:pPr>
+      <w:r>
+        <w:rPr>
+          <w:rFonts w:ascii="Consolas" w:eastAsia="Consolas" w:hAnsi="Consolas" w:cs="Consolas"/>
+          <w:sz w:val="22"/>
+          <w:szCs w:val="22"/>
+          <w:lang w:val="fr-FR"/>
         </w:rPr>
         <w:t xml:space="preserve">     &lt;&lt; (p  ==  q) &lt;&lt; " "</w:t>
       </w:r>
@@ -1099,33 +901,17 @@
           <w:rFonts w:ascii="Consolas" w:eastAsia="Consolas" w:hAnsi="Consolas" w:cs="Consolas"/>
           <w:sz w:val="22"/>
           <w:szCs w:val="22"/>
-        </w:rPr>
-      </w:pPr>
-      <w:r>
-        <w:rPr>
-          <w:rFonts w:ascii="Consolas" w:eastAsia="Consolas" w:hAnsi="Consolas" w:cs="Consolas"/>
-          <w:sz w:val="22"/>
-          <w:szCs w:val="22"/>
-        </w:rPr>
-        <w:t xml:space="preserve">     &lt;&lt; (p  ==  r) &lt;&lt; </w:t>
-      </w:r>
-      <w:proofErr w:type="spellStart"/>
-      <w:r>
-        <w:rPr>
-          <w:rFonts w:ascii="Consolas" w:eastAsia="Consolas" w:hAnsi="Consolas" w:cs="Consolas"/>
-          <w:sz w:val="22"/>
-          <w:szCs w:val="22"/>
-        </w:rPr>
-        <w:t>endl</w:t>
-      </w:r>
-      <w:proofErr w:type="spellEnd"/>
-      <w:r>
-        <w:rPr>
-          <w:rFonts w:ascii="Consolas" w:eastAsia="Consolas" w:hAnsi="Consolas" w:cs="Consolas"/>
-          <w:sz w:val="22"/>
-          <w:szCs w:val="22"/>
-        </w:rPr>
-        <w:t>;</w:t>
+          <w:lang w:val="fr-FR"/>
+        </w:rPr>
+      </w:pPr>
+      <w:r>
+        <w:rPr>
+          <w:rFonts w:ascii="Consolas" w:eastAsia="Consolas" w:hAnsi="Consolas" w:cs="Consolas"/>
+          <w:sz w:val="22"/>
+          <w:szCs w:val="22"/>
+          <w:lang w:val="fr-FR"/>
+        </w:rPr>
+        <w:t xml:space="preserve">     &lt;&lt; (p  ==  r) &lt;&lt; endl;</w:t>
       </w:r>
     </w:p>
     <w:p>
@@ -1194,7 +980,7 @@
           <w:sz w:val="24"/>
           <w:szCs w:val="24"/>
         </w:rPr>
-        <w:t>Put the box created by new somewhere apart from the others — that one is on the heap.</w:t>
+        <w:t>Put the box created by new somewhere apart from the others  that one is on the heap.</w:t>
       </w:r>
     </w:p>
     <w:p>
@@ -1308,50 +1094,22 @@
           <w:sz w:val="22"/>
           <w:szCs w:val="22"/>
         </w:rPr>
-        <w:t>*q += 30;</w:t>
-      </w:r>
-    </w:p>
-    <w:p>
-      <w:pPr>
-        <w:shd w:val="clear" w:color="auto" w:fill="F1F4F7"/>
-        <w:spacing w:line="245" w:lineRule="exact"/>
-        <w:ind w:left="230" w:right="170"/>
-      </w:pPr>
-      <w:proofErr w:type="spellStart"/>
-      <w:r>
-        <w:rPr>
-          <w:rFonts w:ascii="Consolas" w:eastAsia="Consolas" w:hAnsi="Consolas" w:cs="Consolas"/>
-          <w:sz w:val="22"/>
-          <w:szCs w:val="22"/>
-        </w:rPr>
-        <w:t>cout</w:t>
-      </w:r>
-      <w:proofErr w:type="spellEnd"/>
-      <w:r>
-        <w:rPr>
-          <w:rFonts w:ascii="Consolas" w:eastAsia="Consolas" w:hAnsi="Consolas" w:cs="Consolas"/>
-          <w:sz w:val="22"/>
-          <w:szCs w:val="22"/>
-        </w:rPr>
-        <w:t xml:space="preserve"> &lt;&lt; *p &lt;&lt; " " &lt;&lt; *q &lt;&lt; " " &lt;&lt; a &lt;&lt; " " &lt;&lt; b &lt;&lt; </w:t>
-      </w:r>
-      <w:proofErr w:type="spellStart"/>
-      <w:r>
-        <w:rPr>
-          <w:rFonts w:ascii="Consolas" w:eastAsia="Consolas" w:hAnsi="Consolas" w:cs="Consolas"/>
-          <w:sz w:val="22"/>
-          <w:szCs w:val="22"/>
-        </w:rPr>
-        <w:t>endl</w:t>
-      </w:r>
-      <w:proofErr w:type="spellEnd"/>
-      <w:r>
-        <w:rPr>
-          <w:rFonts w:ascii="Consolas" w:eastAsia="Consolas" w:hAnsi="Consolas" w:cs="Consolas"/>
-          <w:sz w:val="22"/>
-          <w:szCs w:val="22"/>
-        </w:rPr>
-        <w:t>;</w:t>
+        <w:t>*q += 30</w:t>
+      </w:r>
+    </w:p>
+    <w:p>
+      <w:pPr>
+        <w:shd w:val="clear" w:color="auto" w:fill="F1F4F7"/>
+        <w:spacing w:line="245" w:lineRule="exact"/>
+        <w:ind w:left="230" w:right="170"/>
+      </w:pPr>
+      <w:r>
+        <w:rPr>
+          <w:rFonts w:ascii="Consolas" w:eastAsia="Consolas" w:hAnsi="Consolas" w:cs="Consolas"/>
+          <w:sz w:val="22"/>
+          <w:szCs w:val="22"/>
+        </w:rPr>
+        <w:t>cout &lt;&lt; *p &lt;&lt; " " &lt;&lt; *q &lt;&lt; " " &lt;&lt; a &lt;&lt; " " &lt;&lt; b &lt;&lt; endl;</w:t>
       </w:r>
     </w:p>
     <w:p>
@@ -1359,6 +1117,11 @@
         <w:shd w:val="clear" w:color="auto" w:fill="F1F4F7"/>
         <w:spacing w:after="90" w:line="245" w:lineRule="exact"/>
         <w:ind w:left="230" w:right="170"/>
+        <w:rPr>
+          <w:rFonts w:ascii="Consolas" w:eastAsia="Consolas" w:hAnsi="Consolas" w:cs="Consolas"/>
+          <w:sz w:val="22"/>
+          <w:szCs w:val="22"/>
+        </w:rPr>
       </w:pPr>
       <w:r>
         <w:rPr>
@@ -1367,6 +1130,54 @@
           <w:szCs w:val="22"/>
         </w:rPr>
         <w:t>delete q;</w:t>
+      </w:r>
+    </w:p>
+    <w:p>
+      <w:pPr>
+        <w:shd w:val="clear" w:color="auto" w:fill="F1F4F7"/>
+        <w:spacing w:after="90" w:line="245" w:lineRule="exact"/>
+        <w:ind w:left="230" w:right="170"/>
+        <w:rPr>
+          <w:rFonts w:ascii="Consolas" w:eastAsia="Consolas" w:hAnsi="Consolas" w:cs="Consolas"/>
+          <w:sz w:val="22"/>
+          <w:szCs w:val="22"/>
+        </w:rPr>
+      </w:pPr>
+    </w:p>
+    <w:p>
+      <w:pPr>
+        <w:shd w:val="clear" w:color="auto" w:fill="F1F4F7"/>
+        <w:spacing w:after="90" w:line="245" w:lineRule="exact"/>
+        <w:ind w:left="230" w:right="170"/>
+        <w:rPr>
+          <w:rFonts w:ascii="Consolas" w:eastAsia="Consolas" w:hAnsi="Consolas" w:cs="Consolas"/>
+          <w:sz w:val="22"/>
+          <w:szCs w:val="22"/>
+        </w:rPr>
+      </w:pPr>
+      <w:r>
+        <w:rPr>
+          <w:rFonts w:ascii="Consolas" w:eastAsia="Consolas" w:hAnsi="Consolas" w:cs="Consolas"/>
+          <w:sz w:val="22"/>
+          <w:szCs w:val="22"/>
+        </w:rPr>
+        <w:t>Output:</w:t>
+      </w:r>
+      <w:r>
+        <w:rPr>
+          <w:rFonts w:ascii="Consolas" w:eastAsia="Consolas" w:hAnsi="Consolas" w:cs="Consolas"/>
+          <w:sz w:val="22"/>
+          <w:szCs w:val="22"/>
+        </w:rPr>
+        <w:t xml:space="preserve"> 35 35</w:t>
+      </w:r>
+      <w:r>
+        <w:rPr>
+          <w:rFonts w:ascii="Consolas" w:eastAsia="Consolas" w:hAnsi="Consolas" w:cs="Consolas"/>
+          <w:sz w:val="22"/>
+          <w:szCs w:val="22"/>
+        </w:rPr>
+        <w:t xml:space="preserve"> 10 20</w:t>
       </w:r>
     </w:p>
     <w:p>
@@ -1456,15 +1267,15 @@
         <w:spacing w:line="245" w:lineRule="exact"/>
         <w:ind w:left="230" w:right="170"/>
         <w:rPr>
-          <w:lang w:val="fr-FR"/>
-        </w:rPr>
-      </w:pPr>
-      <w:r>
-        <w:rPr>
-          <w:rFonts w:ascii="Consolas" w:eastAsia="Consolas" w:hAnsi="Consolas" w:cs="Consolas"/>
-          <w:sz w:val="22"/>
-          <w:szCs w:val="22"/>
-          <w:lang w:val="fr-FR"/>
+          <w:lang w:val="en-US"/>
+        </w:rPr>
+      </w:pPr>
+      <w:r>
+        <w:rPr>
+          <w:rFonts w:ascii="Consolas" w:eastAsia="Consolas" w:hAnsi="Consolas" w:cs="Consolas"/>
+          <w:sz w:val="22"/>
+          <w:szCs w:val="22"/>
+          <w:lang w:val="en-US"/>
         </w:rPr>
         <w:t>*q += 30;</w:t>
       </w:r>
@@ -1475,15 +1286,15 @@
         <w:spacing w:line="245" w:lineRule="exact"/>
         <w:ind w:left="230" w:right="170"/>
         <w:rPr>
-          <w:lang w:val="fr-FR"/>
-        </w:rPr>
-      </w:pPr>
-      <w:r>
-        <w:rPr>
-          <w:rFonts w:ascii="Consolas" w:eastAsia="Consolas" w:hAnsi="Consolas" w:cs="Consolas"/>
-          <w:sz w:val="22"/>
-          <w:szCs w:val="22"/>
-          <w:lang w:val="fr-FR"/>
+          <w:lang w:val="en-US"/>
+        </w:rPr>
+      </w:pPr>
+      <w:r>
+        <w:rPr>
+          <w:rFonts w:ascii="Consolas" w:eastAsia="Consolas" w:hAnsi="Consolas" w:cs="Consolas"/>
+          <w:sz w:val="22"/>
+          <w:szCs w:val="22"/>
+          <w:lang w:val="en-US"/>
         </w:rPr>
         <w:t>b = *q + *p;</w:t>
       </w:r>
@@ -1494,37 +1305,17 @@
         <w:spacing w:line="245" w:lineRule="exact"/>
         <w:ind w:left="230" w:right="170"/>
         <w:rPr>
-          <w:lang w:val="fr-FR"/>
-        </w:rPr>
-      </w:pPr>
-      <w:r>
-        <w:rPr>
-          <w:rFonts w:ascii="Consolas" w:eastAsia="Consolas" w:hAnsi="Consolas" w:cs="Consolas"/>
-          <w:sz w:val="22"/>
-          <w:szCs w:val="22"/>
-          <w:lang w:val="fr-FR"/>
-        </w:rPr>
-        <w:t xml:space="preserve">cout &lt;&lt; *p &lt;&lt; " " &lt;&lt; *q &lt;&lt; " " &lt;&lt; a &lt;&lt; " " &lt;&lt; b &lt;&lt; </w:t>
-      </w:r>
-      <w:proofErr w:type="spellStart"/>
-      <w:r>
-        <w:rPr>
-          <w:rFonts w:ascii="Consolas" w:eastAsia="Consolas" w:hAnsi="Consolas" w:cs="Consolas"/>
-          <w:sz w:val="22"/>
-          <w:szCs w:val="22"/>
-          <w:lang w:val="fr-FR"/>
-        </w:rPr>
-        <w:t>endl</w:t>
-      </w:r>
-      <w:proofErr w:type="spellEnd"/>
-      <w:r>
-        <w:rPr>
-          <w:rFonts w:ascii="Consolas" w:eastAsia="Consolas" w:hAnsi="Consolas" w:cs="Consolas"/>
-          <w:sz w:val="22"/>
-          <w:szCs w:val="22"/>
-          <w:lang w:val="fr-FR"/>
-        </w:rPr>
-        <w:t>;</w:t>
+          <w:lang w:val="en-US"/>
+        </w:rPr>
+      </w:pPr>
+      <w:r>
+        <w:rPr>
+          <w:rFonts w:ascii="Consolas" w:eastAsia="Consolas" w:hAnsi="Consolas" w:cs="Consolas"/>
+          <w:sz w:val="22"/>
+          <w:szCs w:val="22"/>
+          <w:lang w:val="en-US"/>
+        </w:rPr>
+        <w:t>cout &lt;&lt; *p &lt;&lt; " " &lt;&lt; *q &lt;&lt; " " &lt;&lt; a &lt;&lt; " " &lt;&lt; b &lt;&lt; endl;</w:t>
       </w:r>
     </w:p>
     <w:p>
@@ -1547,6 +1338,11 @@
         <w:shd w:val="clear" w:color="auto" w:fill="F1F4F7"/>
         <w:spacing w:after="90" w:line="245" w:lineRule="exact"/>
         <w:ind w:left="230" w:right="170"/>
+        <w:rPr>
+          <w:rFonts w:ascii="Consolas" w:eastAsia="Consolas" w:hAnsi="Consolas" w:cs="Consolas"/>
+          <w:sz w:val="22"/>
+          <w:szCs w:val="22"/>
+        </w:rPr>
       </w:pPr>
       <w:r>
         <w:rPr>
@@ -1556,6 +1352,25 @@
         </w:rPr>
         <w:t>delete p;</w:t>
       </w:r>
+    </w:p>
+    <w:p>
+      <w:pPr>
+        <w:shd w:val="clear" w:color="auto" w:fill="F1F4F7"/>
+        <w:spacing w:after="90" w:line="245" w:lineRule="exact"/>
+        <w:ind w:left="230" w:right="170"/>
+        <w:rPr>
+          <w:rFonts w:ascii="Consolas" w:eastAsia="Consolas" w:hAnsi="Consolas" w:cs="Consolas"/>
+          <w:sz w:val="22"/>
+          <w:szCs w:val="22"/>
+        </w:rPr>
+      </w:pPr>
+    </w:p>
+    <w:p>
+      <w:pPr>
+        <w:shd w:val="clear" w:color="auto" w:fill="F1F4F7"/>
+        <w:spacing w:after="90" w:line="245" w:lineRule="exact"/>
+        <w:ind w:left="230" w:right="170"/>
+      </w:pPr>
     </w:p>
     <w:p>
       <w:pPr>
@@ -1653,41 +1468,13 @@
         <w:spacing w:line="245" w:lineRule="exact"/>
         <w:ind w:left="230" w:right="170"/>
       </w:pPr>
-      <w:proofErr w:type="spellStart"/>
-      <w:r>
-        <w:rPr>
-          <w:rFonts w:ascii="Consolas" w:eastAsia="Consolas" w:hAnsi="Consolas" w:cs="Consolas"/>
-          <w:sz w:val="22"/>
-          <w:szCs w:val="22"/>
-        </w:rPr>
-        <w:t>cout</w:t>
-      </w:r>
-      <w:proofErr w:type="spellEnd"/>
-      <w:r>
-        <w:rPr>
-          <w:rFonts w:ascii="Consolas" w:eastAsia="Consolas" w:hAnsi="Consolas" w:cs="Consolas"/>
-          <w:sz w:val="22"/>
-          <w:szCs w:val="22"/>
-        </w:rPr>
-        <w:t xml:space="preserve"> &lt;&lt; a &lt;&lt; " " &lt;&lt; *p &lt;&lt; </w:t>
-      </w:r>
-      <w:proofErr w:type="spellStart"/>
-      <w:r>
-        <w:rPr>
-          <w:rFonts w:ascii="Consolas" w:eastAsia="Consolas" w:hAnsi="Consolas" w:cs="Consolas"/>
-          <w:sz w:val="22"/>
-          <w:szCs w:val="22"/>
-        </w:rPr>
-        <w:t>endl</w:t>
-      </w:r>
-      <w:proofErr w:type="spellEnd"/>
-      <w:r>
-        <w:rPr>
-          <w:rFonts w:ascii="Consolas" w:eastAsia="Consolas" w:hAnsi="Consolas" w:cs="Consolas"/>
-          <w:sz w:val="22"/>
-          <w:szCs w:val="22"/>
-        </w:rPr>
-        <w:t>;</w:t>
+      <w:r>
+        <w:rPr>
+          <w:rFonts w:ascii="Consolas" w:eastAsia="Consolas" w:hAnsi="Consolas" w:cs="Consolas"/>
+          <w:sz w:val="22"/>
+          <w:szCs w:val="22"/>
+        </w:rPr>
+        <w:t>cout &lt;&lt; a &lt;&lt; " " &lt;&lt; *p &lt;&lt; endl;</w:t>
       </w:r>
     </w:p>
     <w:p>
@@ -1695,6 +1482,11 @@
         <w:shd w:val="clear" w:color="auto" w:fill="F1F4F7"/>
         <w:spacing w:after="90" w:line="245" w:lineRule="exact"/>
         <w:ind w:left="230" w:right="170"/>
+        <w:rPr>
+          <w:rFonts w:ascii="Consolas" w:eastAsia="Consolas" w:hAnsi="Consolas" w:cs="Consolas"/>
+          <w:sz w:val="22"/>
+          <w:szCs w:val="22"/>
+        </w:rPr>
       </w:pPr>
       <w:r>
         <w:rPr>
@@ -1807,41 +1599,13 @@
         <w:spacing w:line="245" w:lineRule="exact"/>
         <w:ind w:left="230" w:right="170"/>
       </w:pPr>
-      <w:proofErr w:type="spellStart"/>
-      <w:r>
-        <w:rPr>
-          <w:rFonts w:ascii="Consolas" w:eastAsia="Consolas" w:hAnsi="Consolas" w:cs="Consolas"/>
-          <w:sz w:val="22"/>
-          <w:szCs w:val="22"/>
-        </w:rPr>
-        <w:t>cout</w:t>
-      </w:r>
-      <w:proofErr w:type="spellEnd"/>
-      <w:r>
-        <w:rPr>
-          <w:rFonts w:ascii="Consolas" w:eastAsia="Consolas" w:hAnsi="Consolas" w:cs="Consolas"/>
-          <w:sz w:val="22"/>
-          <w:szCs w:val="22"/>
-        </w:rPr>
-        <w:t xml:space="preserve"> &lt;&lt; *p &lt;&lt; " " &lt;&lt; *q &lt;&lt; " " &lt;&lt; a &lt;&lt; " " &lt;&lt; b &lt;&lt; </w:t>
-      </w:r>
-      <w:proofErr w:type="spellStart"/>
-      <w:r>
-        <w:rPr>
-          <w:rFonts w:ascii="Consolas" w:eastAsia="Consolas" w:hAnsi="Consolas" w:cs="Consolas"/>
-          <w:sz w:val="22"/>
-          <w:szCs w:val="22"/>
-        </w:rPr>
-        <w:t>endl</w:t>
-      </w:r>
-      <w:proofErr w:type="spellEnd"/>
-      <w:r>
-        <w:rPr>
-          <w:rFonts w:ascii="Consolas" w:eastAsia="Consolas" w:hAnsi="Consolas" w:cs="Consolas"/>
-          <w:sz w:val="22"/>
-          <w:szCs w:val="22"/>
-        </w:rPr>
-        <w:t>;</w:t>
+      <w:r>
+        <w:rPr>
+          <w:rFonts w:ascii="Consolas" w:eastAsia="Consolas" w:hAnsi="Consolas" w:cs="Consolas"/>
+          <w:sz w:val="22"/>
+          <w:szCs w:val="22"/>
+        </w:rPr>
+        <w:t>cout &lt;&lt; *p &lt;&lt; " " &lt;&lt; *q &lt;&lt; " " &lt;&lt; a &lt;&lt; " " &lt;&lt; b &lt;&lt; endl;</w:t>
       </w:r>
     </w:p>
     <w:p>
@@ -1946,41 +1710,13 @@
         <w:spacing w:line="245" w:lineRule="exact"/>
         <w:ind w:left="230" w:right="170"/>
       </w:pPr>
-      <w:proofErr w:type="spellStart"/>
-      <w:r>
-        <w:rPr>
-          <w:rFonts w:ascii="Consolas" w:eastAsia="Consolas" w:hAnsi="Consolas" w:cs="Consolas"/>
-          <w:sz w:val="22"/>
-          <w:szCs w:val="22"/>
-        </w:rPr>
-        <w:t>cout</w:t>
-      </w:r>
-      <w:proofErr w:type="spellEnd"/>
-      <w:r>
-        <w:rPr>
-          <w:rFonts w:ascii="Consolas" w:eastAsia="Consolas" w:hAnsi="Consolas" w:cs="Consolas"/>
-          <w:sz w:val="22"/>
-          <w:szCs w:val="22"/>
-        </w:rPr>
-        <w:t xml:space="preserve"> &lt;&lt; b &lt;&lt; " " &lt;&lt; a &lt;&lt; </w:t>
-      </w:r>
-      <w:proofErr w:type="spellStart"/>
-      <w:r>
-        <w:rPr>
-          <w:rFonts w:ascii="Consolas" w:eastAsia="Consolas" w:hAnsi="Consolas" w:cs="Consolas"/>
-          <w:sz w:val="22"/>
-          <w:szCs w:val="22"/>
-        </w:rPr>
-        <w:t>endl</w:t>
-      </w:r>
-      <w:proofErr w:type="spellEnd"/>
-      <w:r>
-        <w:rPr>
-          <w:rFonts w:ascii="Consolas" w:eastAsia="Consolas" w:hAnsi="Consolas" w:cs="Consolas"/>
-          <w:sz w:val="22"/>
-          <w:szCs w:val="22"/>
-        </w:rPr>
-        <w:t>;</w:t>
+      <w:r>
+        <w:rPr>
+          <w:rFonts w:ascii="Consolas" w:eastAsia="Consolas" w:hAnsi="Consolas" w:cs="Consolas"/>
+          <w:sz w:val="22"/>
+          <w:szCs w:val="22"/>
+        </w:rPr>
+        <w:t>cout &lt;&lt; b &lt;&lt; " " &lt;&lt; a &lt;&lt; endl;</w:t>
       </w:r>
     </w:p>
     <w:p>

</xml_diff>